<commit_message>
Rewrite README; fill team details in the final report; add team task briefs
- README.md: full guide covering the problem, architecture, live validation
  (verify:demo 19/19 screenshot and fault timeline), local run, dataset and
  GNN training/testing, deploy (npm run up), verify, fault demo, destroy,
  integrating your own traces/model/alerts, configuration and caveats.
- Final report: third member (Nagulesh, 24BIT0482), student A/B/C mapping,
  literature and novelty contributions; regenerated .docx and .pdf.
- Docs/report-build/patch_docx.py: in-place text replacement in the
  finished report that keeps edits made in Word.
- Docs/team-tasks/: task briefs for Kabilesh and Nagulesh.

Co-Authored-By: Claude Opus 5.5 <noreply@anthropic.com>
</commit_message>
<xml_diff>
--- a/Docs/Phase1_Report_Microservice_Analysis_v2.docx
+++ b/Docs/Phase1_Report_Microservice_Analysis_v2.docx
@@ -1,6 +1,6 @@
 
 <file path=word/document.xml><?xml version="1.0" encoding="utf-8"?>
-<w:document xmlns:wpc="http://schemas.microsoft.com/office/word/2010/wordprocessingCanvas" xmlns:cx="http://schemas.microsoft.com/office/drawing/2014/chartex" xmlns:cx1="http://schemas.microsoft.com/office/drawing/2015/9/8/chartex" xmlns:cx2="http://schemas.microsoft.com/office/drawing/2015/10/21/chartex" xmlns:cx3="http://schemas.microsoft.com/office/drawing/2016/5/9/chartex" xmlns:cx4="http://schemas.microsoft.com/office/drawing/2016/5/10/chartex" xmlns:cx5="http://schemas.microsoft.com/office/drawing/2016/5/11/chartex" xmlns:cx6="http://schemas.microsoft.com/office/drawing/2016/5/12/chartex" xmlns:cx7="http://schemas.microsoft.com/office/drawing/2016/5/13/chartex" xmlns:cx8="http://schemas.microsoft.com/office/drawing/2016/5/14/chartex" xmlns:mc="http://schemas.openxmlformats.org/markup-compatibility/2006" xmlns:aink="http://schemas.microsoft.com/office/drawing/2016/ink" xmlns:am3d="http://schemas.microsoft.com/office/drawing/2017/model3d" xmlns:o="urn:schemas-microsoft-com:office:office" xmlns:oel="http://schemas.microsoft.com/office/2019/extlst" xmlns:r="http://schemas.openxmlformats.org/officeDocument/2006/relationships" xmlns:m="http://schemas.openxmlformats.org/officeDocument/2006/math" xmlns:v="urn:schemas-microsoft-com:vml" xmlns:wp14="http://schemas.microsoft.com/office/word/2010/wordprocessingDrawing" xmlns:wp="http://schemas.openxmlformats.org/drawingml/2006/wordprocessingDrawing" xmlns:w10="urn:schemas-microsoft-com:office:word" xmlns:w="http://schemas.openxmlformats.org/wordprocessingml/2006/main" xmlns:w14="http://schemas.microsoft.com/office/word/2010/wordml" xmlns:w15="http://schemas.microsoft.com/office/word/2012/wordml" xmlns:w16cei="http://schemas.microsoft.com/office/word/2026/wordml/cei" xmlns:w16cex="http://schemas.microsoft.com/office/word/2018/wordml/cex" xmlns:w16cid="http://schemas.microsoft.com/office/word/2016/wordml/cid" xmlns:w16="http://schemas.microsoft.com/office/word/2018/wordml" xmlns:w16du="http://schemas.microsoft.com/office/word/2023/wordml/word16du" xmlns:w16sdtdh="http://schemas.microsoft.com/office/word/2020/wordml/sdtdatahash" xmlns:w16sdtfl="http://schemas.microsoft.com/office/word/2024/wordml/sdtformatlock" xmlns:w16se="http://schemas.microsoft.com/office/word/2015/wordml/symex" xmlns:wpg="http://schemas.microsoft.com/office/word/2010/wordprocessingGroup" xmlns:wpi="http://schemas.microsoft.com/office/word/2010/wordprocessingInk" xmlns:wne="http://schemas.microsoft.com/office/word/2006/wordml" xmlns:wps="http://schemas.microsoft.com/office/word/2010/wordprocessingShape" mc:Ignorable="w14 w15 w16se w16cid w16 w16cex w16sdtdh w16sdtfl w16du wp14">
+<w:document xmlns:wpc="http://schemas.microsoft.com/office/word/2010/wordprocessingCanvas" xmlns:cx="http://schemas.microsoft.com/office/drawing/2014/chartex" xmlns:cx1="http://schemas.microsoft.com/office/drawing/2015/9/8/chartex" xmlns:cx2="http://schemas.microsoft.com/office/drawing/2015/10/21/chartex" xmlns:cx3="http://schemas.microsoft.com/office/drawing/2016/5/9/chartex" xmlns:cx4="http://schemas.microsoft.com/office/drawing/2016/5/10/chartex" xmlns:cx5="http://schemas.microsoft.com/office/drawing/2016/5/11/chartex" xmlns:cx6="http://schemas.microsoft.com/office/drawing/2016/5/12/chartex" xmlns:cx7="http://schemas.microsoft.com/office/drawing/2016/5/13/chartex" xmlns:cx8="http://schemas.microsoft.com/office/drawing/2016/5/14/chartex" xmlns:mc="http://schemas.openxmlformats.org/markup-compatibility/2006" xmlns:aink="http://schemas.microsoft.com/office/drawing/2016/ink" xmlns:am3d="http://schemas.microsoft.com/office/drawing/2017/model3d" xmlns:o="urn:schemas-microsoft-com:office:office" xmlns:oel="http://schemas.microsoft.com/office/2019/extlst" xmlns:r="http://schemas.openxmlformats.org/officeDocument/2006/relationships" xmlns:m="http://schemas.openxmlformats.org/officeDocument/2006/math" xmlns:v="urn:schemas-microsoft-com:vml" xmlns:wp14="http://schemas.microsoft.com/office/word/2010/wordprocessingDrawing" xmlns:wp="http://schemas.openxmlformats.org/drawingml/2006/wordprocessingDrawing" xmlns:w10="urn:schemas-microsoft-com:office:word" xmlns:w="http://schemas.openxmlformats.org/wordprocessingml/2006/main" xmlns:w14="http://schemas.microsoft.com/office/word/2010/wordml" xmlns:w15="http://schemas.microsoft.com/office/word/2012/wordml" xmlns:w16cex="http://schemas.microsoft.com/office/word/2018/wordml/cex" xmlns:w16cid="http://schemas.microsoft.com/office/word/2016/wordml/cid" xmlns:w16="http://schemas.microsoft.com/office/word/2018/wordml" xmlns:w16du="http://schemas.microsoft.com/office/word/2023/wordml/word16du" xmlns:w16sdtdh="http://schemas.microsoft.com/office/word/2020/wordml/sdtdatahash" xmlns:w16sdtfl="http://schemas.microsoft.com/office/word/2024/wordml/sdtformatlock" xmlns:w16se="http://schemas.microsoft.com/office/word/2015/wordml/symex" xmlns:wpg="http://schemas.microsoft.com/office/word/2010/wordprocessingGroup" xmlns:wpi="http://schemas.microsoft.com/office/word/2010/wordprocessingInk" xmlns:wne="http://schemas.microsoft.com/office/word/2006/wordml" xmlns:wps="http://schemas.microsoft.com/office/word/2010/wordprocessingShape" mc:Ignorable="w14 w15 w16se w16cid w16 w16cex w16sdtdh w16sdtfl w16du wp14">
   <w:body>
     <w:p>
       <w:pPr>
@@ -1379,7 +1379,10 @@
         <w:pStyle w:val="Heading2"/>
       </w:pPr>
       <w:r>
-        <w:t>Student A (Papers 1-5): Telemetry and Tracing</w:t>
+        <w:t>Naveen Kumar A</w:t>
+      </w:r>
+      <w:r>
+        <w:t xml:space="preserve"> (Papers 1-5): Telemetry and Tracing</w:t>
       </w:r>
     </w:p>
     <w:p>
@@ -1411,7 +1414,10 @@
         <w:pStyle w:val="Heading2"/>
       </w:pPr>
       <w:r>
-        <w:t>Student B (Papers 6-10): Knowledge Graphs in Cloud Ops</w:t>
+        <w:t>Kabilesh SN</w:t>
+      </w:r>
+      <w:r>
+        <w:t xml:space="preserve"> (Papers 6-10): Knowledge Graphs in Cloud Ops</w:t>
       </w:r>
     </w:p>
     <w:p>
@@ -1440,7 +1446,10 @@
         <w:pStyle w:val="Heading2"/>
       </w:pPr>
       <w:r>
-        <w:t>Student C (Papers 11-15): AI-Driven Anomaly Detection</w:t>
+        <w:t>Nagulesh</w:t>
+      </w:r>
+      <w:r>
+        <w:t xml:space="preserve"> (Papers 11-15): AI-Driven Anomaly Detection</w:t>
       </w:r>
     </w:p>
     <w:p>
@@ -1552,6 +1561,7 @@
       </w:pPr>
       <w:r>
         <w:rPr>
+          <w:noProof/>
           <w:lang w:val="en-IN"/>
         </w:rPr>
         <w:drawing>
@@ -1627,6 +1637,7 @@
       </w:pPr>
       <w:r>
         <w:rPr>
+          <w:noProof/>
           <w:lang w:val="en-IN"/>
         </w:rPr>
         <w:drawing>
@@ -2471,7 +2482,7 @@
 </file>
 
 <file path=word/numbering.xml><?xml version="1.0" encoding="utf-8"?>
-<w:numbering xmlns:wpc="http://schemas.microsoft.com/office/word/2010/wordprocessingCanvas" xmlns:cx="http://schemas.microsoft.com/office/drawing/2014/chartex" xmlns:cx1="http://schemas.microsoft.com/office/drawing/2015/9/8/chartex" xmlns:cx2="http://schemas.microsoft.com/office/drawing/2015/10/21/chartex" xmlns:cx3="http://schemas.microsoft.com/office/drawing/2016/5/9/chartex" xmlns:cx4="http://schemas.microsoft.com/office/drawing/2016/5/10/chartex" xmlns:cx5="http://schemas.microsoft.com/office/drawing/2016/5/11/chartex" xmlns:cx6="http://schemas.microsoft.com/office/drawing/2016/5/12/chartex" xmlns:cx7="http://schemas.microsoft.com/office/drawing/2016/5/13/chartex" xmlns:cx8="http://schemas.microsoft.com/office/drawing/2016/5/14/chartex" xmlns:mc="http://schemas.openxmlformats.org/markup-compatibility/2006" xmlns:aink="http://schemas.microsoft.com/office/drawing/2016/ink" xmlns:am3d="http://schemas.microsoft.com/office/drawing/2017/model3d" xmlns:o="urn:schemas-microsoft-com:office:office" xmlns:oel="http://schemas.microsoft.com/office/2019/extlst" xmlns:r="http://schemas.openxmlformats.org/officeDocument/2006/relationships" xmlns:m="http://schemas.openxmlformats.org/officeDocument/2006/math" xmlns:v="urn:schemas-microsoft-com:vml" xmlns:wp14="http://schemas.microsoft.com/office/word/2010/wordprocessingDrawing" xmlns:wp="http://schemas.openxmlformats.org/drawingml/2006/wordprocessingDrawing" xmlns:w10="urn:schemas-microsoft-com:office:word" xmlns:w="http://schemas.openxmlformats.org/wordprocessingml/2006/main" xmlns:w14="http://schemas.microsoft.com/office/word/2010/wordml" xmlns:w15="http://schemas.microsoft.com/office/word/2012/wordml" xmlns:w16cei="http://schemas.microsoft.com/office/word/2026/wordml/cei" xmlns:w16cex="http://schemas.microsoft.com/office/word/2018/wordml/cex" xmlns:w16cid="http://schemas.microsoft.com/office/word/2016/wordml/cid" xmlns:w16="http://schemas.microsoft.com/office/word/2018/wordml" xmlns:w16du="http://schemas.microsoft.com/office/word/2023/wordml/word16du" xmlns:w16sdtdh="http://schemas.microsoft.com/office/word/2020/wordml/sdtdatahash" xmlns:w16sdtfl="http://schemas.microsoft.com/office/word/2024/wordml/sdtformatlock" xmlns:w16se="http://schemas.microsoft.com/office/word/2015/wordml/symex" xmlns:wpg="http://schemas.microsoft.com/office/word/2010/wordprocessingGroup" xmlns:wpi="http://schemas.microsoft.com/office/word/2010/wordprocessingInk" xmlns:wne="http://schemas.microsoft.com/office/word/2006/wordml" xmlns:wps="http://schemas.microsoft.com/office/word/2010/wordprocessingShape" mc:Ignorable="w14 w15 w16se w16cid w16 w16cex w16sdtdh w16sdtfl w16du wp14">
+<w:numbering xmlns:wpc="http://schemas.microsoft.com/office/word/2010/wordprocessingCanvas" xmlns:cx="http://schemas.microsoft.com/office/drawing/2014/chartex" xmlns:cx1="http://schemas.microsoft.com/office/drawing/2015/9/8/chartex" xmlns:cx2="http://schemas.microsoft.com/office/drawing/2015/10/21/chartex" xmlns:cx3="http://schemas.microsoft.com/office/drawing/2016/5/9/chartex" xmlns:cx4="http://schemas.microsoft.com/office/drawing/2016/5/10/chartex" xmlns:cx5="http://schemas.microsoft.com/office/drawing/2016/5/11/chartex" xmlns:cx6="http://schemas.microsoft.com/office/drawing/2016/5/12/chartex" xmlns:cx7="http://schemas.microsoft.com/office/drawing/2016/5/13/chartex" xmlns:cx8="http://schemas.microsoft.com/office/drawing/2016/5/14/chartex" xmlns:mc="http://schemas.openxmlformats.org/markup-compatibility/2006" xmlns:aink="http://schemas.microsoft.com/office/drawing/2016/ink" xmlns:am3d="http://schemas.microsoft.com/office/drawing/2017/model3d" xmlns:o="urn:schemas-microsoft-com:office:office" xmlns:oel="http://schemas.microsoft.com/office/2019/extlst" xmlns:r="http://schemas.openxmlformats.org/officeDocument/2006/relationships" xmlns:m="http://schemas.openxmlformats.org/officeDocument/2006/math" xmlns:v="urn:schemas-microsoft-com:vml" xmlns:wp14="http://schemas.microsoft.com/office/word/2010/wordprocessingDrawing" xmlns:wp="http://schemas.openxmlformats.org/drawingml/2006/wordprocessingDrawing" xmlns:w10="urn:schemas-microsoft-com:office:word" xmlns:w="http://schemas.openxmlformats.org/wordprocessingml/2006/main" xmlns:w14="http://schemas.microsoft.com/office/word/2010/wordml" xmlns:w15="http://schemas.microsoft.com/office/word/2012/wordml" xmlns:w16cex="http://schemas.microsoft.com/office/word/2018/wordml/cex" xmlns:w16cid="http://schemas.microsoft.com/office/word/2016/wordml/cid" xmlns:w16="http://schemas.microsoft.com/office/word/2018/wordml" xmlns:w16du="http://schemas.microsoft.com/office/word/2023/wordml/word16du" xmlns:w16sdtdh="http://schemas.microsoft.com/office/word/2020/wordml/sdtdatahash" xmlns:w16sdtfl="http://schemas.microsoft.com/office/word/2024/wordml/sdtformatlock" xmlns:w16se="http://schemas.microsoft.com/office/word/2015/wordml/symex" xmlns:wpg="http://schemas.microsoft.com/office/word/2010/wordprocessingGroup" xmlns:wpi="http://schemas.microsoft.com/office/word/2010/wordprocessingInk" xmlns:wne="http://schemas.microsoft.com/office/word/2006/wordml" xmlns:wps="http://schemas.microsoft.com/office/word/2010/wordprocessingShape" mc:Ignorable="w14 w15 w16se w16cid w16 w16cex w16sdtdh w16sdtfl w16du wp14">
   <w:abstractNum w:abstractNumId="0" w15:restartNumberingAfterBreak="0">
     <w:nsid w:val="FFFFFF7C"/>
     <w:multiLevelType w:val="singleLevel"/>
@@ -3279,6 +3290,7 @@
   <w:style w:type="character" w:default="1" w:styleId="DefaultParagraphFont">
     <w:name w:val="Default Paragraph Font"/>
     <w:uiPriority w:val="1"/>
+    <w:semiHidden/>
     <w:unhideWhenUsed/>
   </w:style>
   <w:style w:type="table" w:default="1" w:styleId="TableNormal">

</xml_diff>